<commit_message>
S04: publico evidencia tras P2P (sin cambios)
</commit_message>
<xml_diff>
--- a/s04-bigquery-avanzado/s04-bigquery-avanzado-evidencias.docx
+++ b/s04-bigquery-avanzado/s04-bigquery-avanzado-evidencias.docx
@@ -178,7 +178,7 @@
                 <w:color w:val="666666"/>
                 <w:sz w:val="21"/>
               </w:rPr>
-              <w:t>[Nombre de quien revisó el P2P]</w:t>
+              <w:t>Gabriela</w:t>
             </w:r>
           </w:p>
         </w:tc>
@@ -225,7 +225,15 @@
                 <w:color w:val="666666"/>
                 <w:sz w:val="21"/>
               </w:rPr>
-              <w:t>19/10/2026</w:t>
+              <w:t>21</w:t>
+            </w:r>
+            <w:r>
+              <w:rPr>
+                <w:i/>
+                <w:color w:val="666666"/>
+                <w:sz w:val="21"/>
+              </w:rPr>
+              <w:t>/10/2026</w:t>
             </w:r>
           </w:p>
         </w:tc>
@@ -333,10 +341,12 @@
         <w:t xml:space="preserve"> hace un full table </w:t>
       </w:r>
       <w:proofErr w:type="spellStart"/>
+      <w:proofErr w:type="gramStart"/>
       <w:r>
         <w:t>scan</w:t>
       </w:r>
       <w:proofErr w:type="spellEnd"/>
+      <w:proofErr w:type="gramEnd"/>
       <w:r>
         <w:t xml:space="preserve"> aunque se pida solo un día.</w:t>
       </w:r>
@@ -565,7 +575,15 @@
       </w:r>
       <w:proofErr w:type="spellEnd"/>
       <w:r>
-        <w:t xml:space="preserve"> &amp; Cluster)</w:t>
+        <w:t xml:space="preserve"> &amp; </w:t>
+      </w:r>
+      <w:proofErr w:type="gramStart"/>
+      <w:r>
+        <w:t>Cluster</w:t>
+      </w:r>
+      <w:proofErr w:type="gramEnd"/>
+      <w:r>
+        <w:t>)</w:t>
       </w:r>
     </w:p>
     <w:p>
@@ -1916,7 +1934,15 @@
       </w:r>
       <w:proofErr w:type="spellEnd"/>
       <w:r>
-        <w:t xml:space="preserve"> que agrupa por usuario (gasto total, número de transacciones, ticket medio, compra máxima), filtrando los que superan 500€ de gasto acumulado, cruzado con </w:t>
+        <w:t xml:space="preserve"> que agrupa por usuario (gasto total, número de transacciones, </w:t>
+      </w:r>
+      <w:proofErr w:type="gramStart"/>
+      <w:r>
+        <w:t>ticket</w:t>
+      </w:r>
+      <w:proofErr w:type="gramEnd"/>
+      <w:r>
+        <w:t xml:space="preserve"> medio, compra máxima), filtrando los que superan 500€ de gasto acumulado, cruzado con </w:t>
       </w:r>
       <w:proofErr w:type="spellStart"/>
       <w:r>
@@ -2269,7 +2295,15 @@
     </w:p>
     <w:p>
       <w:r>
-        <w:t xml:space="preserve">No he puesto ROUND en </w:t>
+        <w:t xml:space="preserve">No he puesto </w:t>
+      </w:r>
+      <w:proofErr w:type="gramStart"/>
+      <w:r>
+        <w:t>ROUND</w:t>
+      </w:r>
+      <w:proofErr w:type="gramEnd"/>
+      <w:r>
+        <w:t xml:space="preserve"> en </w:t>
       </w:r>
       <w:proofErr w:type="spellStart"/>
       <w:r>
@@ -2465,8 +2499,13 @@
       </w:r>
     </w:p>
     <w:p>
-      <w:r>
-        <w:t xml:space="preserve">ROUND no cambia nada </w:t>
+      <w:proofErr w:type="gramStart"/>
+      <w:r>
+        <w:t>ROUND</w:t>
+      </w:r>
+      <w:proofErr w:type="gramEnd"/>
+      <w:r>
+        <w:t xml:space="preserve"> no cambia nada </w:t>
       </w:r>
       <w:r>
         <w:t>en este caso</w:t>
@@ -3054,9 +3093,14 @@
       </w:r>
       <w:proofErr w:type="spellStart"/>
       <w:r>
-        <w:t>total_ticket</w:t>
+        <w:t>total_</w:t>
+      </w:r>
+      <w:proofErr w:type="gramStart"/>
+      <w:r>
+        <w:t>ticket</w:t>
       </w:r>
       <w:proofErr w:type="spellEnd"/>
+      <w:proofErr w:type="gramEnd"/>
       <w:r>
         <w:t xml:space="preserve"> (Global)</w:t>
       </w:r>
@@ -3088,7 +3132,15 @@
       </w:r>
       <w:proofErr w:type="spellStart"/>
       <w:r>
-        <w:t>total_ticket_global</w:t>
+        <w:t>total_</w:t>
+      </w:r>
+      <w:proofErr w:type="gramStart"/>
+      <w:r>
+        <w:t>ticket</w:t>
+      </w:r>
+      <w:proofErr w:type="gramEnd"/>
+      <w:r>
+        <w:t>_global</w:t>
       </w:r>
       <w:proofErr w:type="spellEnd"/>
       <w:r>
@@ -3388,11 +3440,19 @@
       </w:r>
       <w:proofErr w:type="spellStart"/>
       <w:r>
-        <w:t>dim_transactions_flat</w:t>
+        <w:t>dim_transactions_</w:t>
+      </w:r>
+      <w:proofErr w:type="gramStart"/>
+      <w:r>
+        <w:t>flat</w:t>
       </w:r>
       <w:proofErr w:type="spellEnd"/>
       <w:r>
-        <w:t xml:space="preserve"> ampliada con </w:t>
+        <w:t xml:space="preserve"> ampliada</w:t>
+      </w:r>
+      <w:proofErr w:type="gramEnd"/>
+      <w:r>
+        <w:t xml:space="preserve"> con </w:t>
       </w:r>
       <w:proofErr w:type="spellStart"/>
       <w:r>
@@ -15801,6 +15861,18 @@
       <w:shd w:val="clear" w:color="auto" w:fill="E1DFDD"/>
     </w:rPr>
   </w:style>
+  <w:style w:type="character" w:styleId="Hipervnculovisitado">
+    <w:name w:val="FollowedHyperlink"/>
+    <w:basedOn w:val="Fuentedeprrafopredeter"/>
+    <w:uiPriority w:val="99"/>
+    <w:semiHidden/>
+    <w:unhideWhenUsed/>
+    <w:rsid w:val="00F35C3D"/>
+    <w:rPr>
+      <w:color w:val="800080" w:themeColor="followedHyperlink"/>
+      <w:u w:val="single"/>
+    </w:rPr>
+  </w:style>
 </w:styles>
 </file>
 

</xml_diff>